<commit_message>
doplneni citace dalsich nalezu z NDOP
</commit_message>
<xml_diff>
--- a/Text/Euoniticellus_fulvus_text_rev.docx
+++ b/Text/Euoniticellus_fulvus_text_rev.docx
@@ -178,21 +178,7 @@
         <w:rPr>
           <w:rFonts w:ascii="Times New Roman" w:hAnsi="Times New Roman" w:cs="Times New Roman"/>
         </w:rPr>
-        <w:t xml:space="preserve"> Goeze, 1777 is recorded after 57 years from western Bohemia from Horšovský Týn: CZ – Bohemia occ., Horšov (6443c), 49°32’32.813”N, 12°54’37.864”E, 380 m a.</w:t>
-      </w:r>
-      <w:proofErr w:type="gramStart"/>
-      <w:r>
-        <w:rPr>
-          <w:rFonts w:ascii="Times New Roman" w:hAnsi="Times New Roman" w:cs="Times New Roman"/>
-        </w:rPr>
-        <w:t>s.l.</w:t>
-      </w:r>
-      <w:proofErr w:type="gramEnd"/>
-      <w:r>
-        <w:rPr>
-          <w:rFonts w:ascii="Times New Roman" w:hAnsi="Times New Roman" w:cs="Times New Roman"/>
-        </w:rPr>
-        <w:t>, 8.vii.2025, 1 spec., J. Gaigr leg., det. et coll. The examined specimen was collected in horse dung on a dirt road.</w:t>
+        <w:t xml:space="preserve"> Goeze, 1777 is recorded after 57 years from western Bohemia from Horšovský Týn: CZ – Bohemia occ., Horšov (6443c), 49°32’32.813”N, 12°54’37.864”E, 380 m a.s.l., 8.vii.2025, 1 spec., J. Gaigr leg., det. et coll. The examined specimen was collected in horse dung on a dirt road.</w:t>
       </w:r>
     </w:p>
     <w:p>
@@ -285,21 +271,7 @@
         <w:rPr>
           <w:rFonts w:ascii="Times New Roman" w:hAnsi="Times New Roman" w:cs="Times New Roman"/>
         </w:rPr>
-        <w:t xml:space="preserve"> Goeze, 1777. Bohemia occ., Horšov, 5 km jižně (6443c), 49°32’32.813”N, 12°54’37.864”E, koňský trus na cestě, Horšovská obora, 380 m </w:t>
-      </w:r>
-      <w:proofErr w:type="gramStart"/>
-      <w:r>
-        <w:rPr>
-          <w:rFonts w:ascii="Times New Roman" w:hAnsi="Times New Roman" w:cs="Times New Roman"/>
-        </w:rPr>
-        <w:t>n.m.</w:t>
-      </w:r>
-      <w:proofErr w:type="gramEnd"/>
-      <w:r>
-        <w:rPr>
-          <w:rFonts w:ascii="Times New Roman" w:hAnsi="Times New Roman" w:cs="Times New Roman"/>
-        </w:rPr>
-        <w:t>, 8.V</w:t>
+        <w:t xml:space="preserve"> Goeze, 1777. Bohemia occ., Horšov, 5 km jižně (6443c), 49°32’32.813”N, 12°54’37.864”E, koňský trus na cestě, Horšovská obora, 380 m n.m., 8.V</w:t>
       </w:r>
       <w:r>
         <w:rPr>
@@ -461,15 +433,65 @@
           <w:i/>
           <w:iCs/>
         </w:rPr>
+        <w:t xml:space="preserve"> (</w:t>
+      </w:r>
+      <w:r>
+        <w:rPr>
+          <w:rFonts w:ascii="Times New Roman" w:hAnsi="Times New Roman" w:cs="Times New Roman"/>
+          <w:i/>
+          <w:iCs/>
+        </w:rPr>
+        <w:t>Palaeonthophagus</w:t>
+      </w:r>
+      <w:r>
+        <w:rPr>
+          <w:rFonts w:ascii="Times New Roman" w:hAnsi="Times New Roman" w:cs="Times New Roman"/>
+          <w:i/>
+          <w:iCs/>
+        </w:rPr>
+        <w:t>)</w:t>
+      </w:r>
+      <w:r>
+        <w:rPr>
+          <w:rFonts w:ascii="Times New Roman" w:hAnsi="Times New Roman" w:cs="Times New Roman"/>
+          <w:i/>
+          <w:iCs/>
+        </w:rPr>
         <w:t xml:space="preserve"> </w:t>
       </w:r>
       <w:r>
         <w:rPr>
           <w:rFonts w:ascii="Times New Roman" w:hAnsi="Times New Roman" w:cs="Times New Roman"/>
           <w:i/>
+        </w:rPr>
+        <w:t>ovatus</w:t>
+      </w:r>
+      <w:r>
+        <w:rPr>
+          <w:rFonts w:ascii="Times New Roman" w:hAnsi="Times New Roman" w:cs="Times New Roman"/>
+          <w:i/>
+        </w:rPr>
+        <w:t xml:space="preserve"> </w:t>
+      </w:r>
+      <w:r>
+        <w:rPr>
+          <w:rFonts w:ascii="Times New Roman" w:hAnsi="Times New Roman" w:cs="Times New Roman"/>
+        </w:rPr>
+        <w:t>(Linnaeus, 1767)</w:t>
+      </w:r>
+      <w:r>
+        <w:rPr>
+          <w:rFonts w:ascii="Times New Roman" w:hAnsi="Times New Roman" w:cs="Times New Roman"/>
+        </w:rPr>
+        <w:t xml:space="preserve">, </w:t>
+      </w:r>
+      <w:r>
+        <w:rPr>
+          <w:rFonts w:ascii="Times New Roman" w:hAnsi="Times New Roman" w:cs="Times New Roman"/>
+          <w:i/>
           <w:iCs/>
         </w:rPr>
-        <w:t>(</w:t>
+        <w:t>Onthophagus</w:t>
       </w:r>
       <w:r>
         <w:rPr>
@@ -477,6 +499,14 @@
           <w:i/>
           <w:iCs/>
         </w:rPr>
+        <w:t xml:space="preserve"> (</w:t>
+      </w:r>
+      <w:r>
+        <w:rPr>
+          <w:rFonts w:ascii="Times New Roman" w:hAnsi="Times New Roman" w:cs="Times New Roman"/>
+          <w:i/>
+          <w:iCs/>
+        </w:rPr>
         <w:t>Palaeonthophagus</w:t>
       </w:r>
       <w:r>
@@ -485,122 +515,26 @@
           <w:i/>
           <w:iCs/>
         </w:rPr>
-        <w:t>)</w:t>
-      </w:r>
-      <w:r>
-        <w:rPr>
-          <w:rFonts w:ascii="Times New Roman" w:hAnsi="Times New Roman" w:cs="Times New Roman"/>
-          <w:i/>
-          <w:iCs/>
+        <w:t xml:space="preserve">) </w:t>
+      </w:r>
+      <w:r>
+        <w:rPr>
+          <w:rFonts w:ascii="Times New Roman" w:hAnsi="Times New Roman" w:cs="Times New Roman"/>
+          <w:i/>
+        </w:rPr>
+        <w:t>similis</w:t>
+      </w:r>
+      <w:r>
+        <w:rPr>
+          <w:rFonts w:ascii="Times New Roman" w:hAnsi="Times New Roman" w:cs="Times New Roman"/>
         </w:rPr>
         <w:t xml:space="preserve"> </w:t>
       </w:r>
       <w:r>
         <w:rPr>
           <w:rFonts w:ascii="Times New Roman" w:hAnsi="Times New Roman" w:cs="Times New Roman"/>
-          <w:i/>
-        </w:rPr>
-        <w:t>ovatus</w:t>
-      </w:r>
-      <w:r>
-        <w:rPr>
-          <w:rFonts w:ascii="Times New Roman" w:hAnsi="Times New Roman" w:cs="Times New Roman"/>
-          <w:i/>
-        </w:rPr>
-        <w:t xml:space="preserve"> </w:t>
-      </w:r>
-      <w:r>
-        <w:rPr>
-          <w:rFonts w:ascii="Times New Roman" w:hAnsi="Times New Roman" w:cs="Times New Roman"/>
-        </w:rPr>
-        <w:t>(Linnaeus, 1767)</w:t>
-      </w:r>
-      <w:r>
-        <w:rPr>
-          <w:rFonts w:ascii="Times New Roman" w:hAnsi="Times New Roman" w:cs="Times New Roman"/>
-        </w:rPr>
-        <w:t xml:space="preserve">, </w:t>
-      </w:r>
-      <w:r>
-        <w:rPr>
-          <w:rFonts w:ascii="Times New Roman" w:hAnsi="Times New Roman" w:cs="Times New Roman"/>
-          <w:i/>
-          <w:iCs/>
-        </w:rPr>
-        <w:t>Onthophagus</w:t>
-      </w:r>
-      <w:r>
-        <w:rPr>
-          <w:rFonts w:ascii="Times New Roman" w:hAnsi="Times New Roman" w:cs="Times New Roman"/>
-          <w:i/>
-          <w:iCs/>
-        </w:rPr>
-        <w:t xml:space="preserve"> </w:t>
-      </w:r>
-      <w:r>
-        <w:rPr>
-          <w:rFonts w:ascii="Times New Roman" w:hAnsi="Times New Roman" w:cs="Times New Roman"/>
-          <w:i/>
-          <w:iCs/>
-        </w:rPr>
-        <w:t>(</w:t>
-      </w:r>
-      <w:r>
-        <w:rPr>
-          <w:rFonts w:ascii="Times New Roman" w:hAnsi="Times New Roman" w:cs="Times New Roman"/>
-          <w:i/>
-          <w:iCs/>
-        </w:rPr>
-        <w:t>Palaeonthophagus</w:t>
-      </w:r>
-      <w:r>
-        <w:rPr>
-          <w:rFonts w:ascii="Times New Roman" w:hAnsi="Times New Roman" w:cs="Times New Roman"/>
-          <w:i/>
-          <w:iCs/>
-        </w:rPr>
-        <w:t>)</w:t>
-      </w:r>
-      <w:r>
-        <w:rPr>
-          <w:rFonts w:ascii="Times New Roman" w:hAnsi="Times New Roman" w:cs="Times New Roman"/>
-          <w:i/>
-          <w:iCs/>
-        </w:rPr>
-        <w:t xml:space="preserve"> </w:t>
-      </w:r>
-      <w:r>
-        <w:rPr>
-          <w:rFonts w:ascii="Times New Roman" w:hAnsi="Times New Roman" w:cs="Times New Roman"/>
-          <w:i/>
-        </w:rPr>
-        <w:t>similis</w:t>
-      </w:r>
-      <w:r>
-        <w:rPr>
-          <w:rFonts w:ascii="Times New Roman" w:hAnsi="Times New Roman" w:cs="Times New Roman"/>
-        </w:rPr>
-        <w:t xml:space="preserve"> </w:t>
-      </w:r>
-      <w:r>
-        <w:rPr>
-          <w:rFonts w:ascii="Times New Roman" w:hAnsi="Times New Roman" w:cs="Times New Roman"/>
-        </w:rPr>
-        <w:t>(</w:t>
-      </w:r>
-      <w:proofErr w:type="gramStart"/>
-      <w:r>
-        <w:rPr>
-          <w:rFonts w:ascii="Times New Roman" w:hAnsi="Times New Roman" w:cs="Times New Roman"/>
-        </w:rPr>
-        <w:t>L.G.</w:t>
-      </w:r>
-      <w:proofErr w:type="gramEnd"/>
-      <w:r>
-        <w:rPr>
-          <w:rFonts w:ascii="Times New Roman" w:hAnsi="Times New Roman" w:cs="Times New Roman"/>
-        </w:rPr>
-        <w:t xml:space="preserve"> Scriba, 1790)</w:t>
+        </w:rPr>
+        <w:t>(L.G. Scriba, 1790)</w:t>
       </w:r>
       <w:r>
         <w:rPr>
@@ -776,261 +710,318 @@
         <w:rPr>
           <w:rFonts w:ascii="Times New Roman" w:hAnsi="Times New Roman" w:cs="Times New Roman"/>
         </w:rPr>
-        <w:t>Juřena et al. 2008). V posledních dvou desetiletích však druh zjevně expanduje (Obr. 3</w:t>
+        <w:t xml:space="preserve">Juřena et al. 2008). V posledních dvou desetiletích však druh zjevně expanduje (Obr. 3). </w:t>
+      </w:r>
+      <w:r>
+        <w:rPr>
+          <w:rFonts w:ascii="Times New Roman" w:hAnsi="Times New Roman" w:cs="Times New Roman"/>
+          <w:smallCaps/>
+        </w:rPr>
+        <w:t>Peřinková</w:t>
+      </w:r>
+      <w:r>
+        <w:rPr>
+          <w:rFonts w:ascii="Times New Roman" w:hAnsi="Times New Roman" w:cs="Times New Roman"/>
+        </w:rPr>
+        <w:t xml:space="preserve"> a </w:t>
+      </w:r>
+      <w:r>
+        <w:rPr>
+          <w:rFonts w:ascii="Times New Roman" w:hAnsi="Times New Roman" w:cs="Times New Roman"/>
+          <w:smallCaps/>
+        </w:rPr>
+        <w:t>Fischer</w:t>
+      </w:r>
+      <w:r>
+        <w:rPr>
+          <w:rFonts w:ascii="Times New Roman" w:hAnsi="Times New Roman" w:cs="Times New Roman"/>
+        </w:rPr>
+        <w:t xml:space="preserve"> (2010) popisují šíření druhu do středních poloh </w:t>
+      </w:r>
+      <w:r>
+        <w:rPr>
+          <w:rFonts w:ascii="Times New Roman" w:hAnsi="Times New Roman" w:cs="Times New Roman"/>
+        </w:rPr>
+        <w:t xml:space="preserve">na jihozápadní Moravě, </w:t>
+      </w:r>
+      <w:r>
+        <w:rPr>
+          <w:rFonts w:ascii="Times New Roman" w:hAnsi="Times New Roman" w:cs="Times New Roman"/>
+          <w:smallCaps/>
+        </w:rPr>
+        <w:t>Mertlik</w:t>
+      </w:r>
+      <w:r>
+        <w:rPr>
+          <w:rFonts w:ascii="Times New Roman" w:hAnsi="Times New Roman" w:cs="Times New Roman"/>
+        </w:rPr>
+        <w:t xml:space="preserve"> (2019, 2020) dokládá šíření</w:t>
+      </w:r>
+      <w:r>
+        <w:rPr>
+          <w:rFonts w:ascii="Times New Roman" w:hAnsi="Times New Roman" w:cs="Times New Roman"/>
+        </w:rPr>
+        <w:t xml:space="preserve"> v n</w:t>
+      </w:r>
+      <w:r>
+        <w:rPr>
+          <w:rFonts w:ascii="Times New Roman" w:hAnsi="Times New Roman" w:cs="Times New Roman"/>
+        </w:rPr>
+        <w:t>ižších polohách východních Čech.</w:t>
+      </w:r>
+      <w:r>
+        <w:rPr>
+          <w:rFonts w:ascii="Times New Roman" w:hAnsi="Times New Roman" w:cs="Times New Roman"/>
+        </w:rPr>
+        <w:t xml:space="preserve"> </w:t>
+      </w:r>
+      <w:r>
+        <w:rPr>
+          <w:rFonts w:ascii="Times New Roman" w:hAnsi="Times New Roman" w:cs="Times New Roman"/>
+          <w:i/>
+          <w:iCs/>
+        </w:rPr>
+        <w:t>E. fulvus</w:t>
+      </w:r>
+      <w:r>
+        <w:rPr>
+          <w:rFonts w:ascii="Times New Roman" w:hAnsi="Times New Roman" w:cs="Times New Roman"/>
+        </w:rPr>
+        <w:t xml:space="preserve"> </w:t>
+      </w:r>
+      <w:r>
+        <w:rPr>
+          <w:rFonts w:ascii="Times New Roman" w:hAnsi="Times New Roman" w:cs="Times New Roman"/>
+        </w:rPr>
+        <w:t>byl opět potvrzen na území Prahy (</w:t>
+      </w:r>
+      <w:r>
+        <w:rPr>
+          <w:rFonts w:ascii="Times New Roman" w:hAnsi="Times New Roman" w:cs="Times New Roman"/>
+          <w:smallCaps/>
+        </w:rPr>
+        <w:t>Sommer</w:t>
+      </w:r>
+      <w:r>
+        <w:rPr>
+          <w:rFonts w:ascii="Times New Roman" w:hAnsi="Times New Roman" w:cs="Times New Roman"/>
+        </w:rPr>
+        <w:t xml:space="preserve"> et al. 2024) a Českého krasu (</w:t>
+      </w:r>
+      <w:r>
+        <w:rPr>
+          <w:rFonts w:ascii="Times New Roman" w:hAnsi="Times New Roman" w:cs="Times New Roman"/>
+          <w:smallCaps/>
+        </w:rPr>
+        <w:t>Koštíř</w:t>
+      </w:r>
+      <w:r>
+        <w:rPr>
+          <w:rFonts w:ascii="Times New Roman" w:hAnsi="Times New Roman" w:cs="Times New Roman"/>
+        </w:rPr>
+        <w:t xml:space="preserve"> 2024). Nalezen byl i na Šumavě v nadmořské výšce 800 m. n. m. (</w:t>
+      </w:r>
+      <w:r>
+        <w:rPr>
+          <w:rFonts w:ascii="Times New Roman" w:hAnsi="Times New Roman" w:cs="Times New Roman"/>
+          <w:smallCaps/>
+        </w:rPr>
+        <w:t>Ambrožová</w:t>
+      </w:r>
+      <w:r>
+        <w:rPr>
+          <w:rFonts w:ascii="Times New Roman" w:hAnsi="Times New Roman" w:cs="Times New Roman"/>
+        </w:rPr>
+        <w:t xml:space="preserve"> et al. 2021). Historické údaje z území západních Čech byly publikovány z Františkových Lázní, Stříbra a Horažďovic (</w:t>
+      </w:r>
+      <w:r>
+        <w:rPr>
+          <w:rFonts w:ascii="Times New Roman" w:hAnsi="Times New Roman" w:cs="Times New Roman"/>
+          <w:smallCaps/>
+        </w:rPr>
+        <w:t>Juřena</w:t>
+      </w:r>
+      <w:r>
+        <w:rPr>
+          <w:rFonts w:ascii="Times New Roman" w:hAnsi="Times New Roman" w:cs="Times New Roman"/>
+        </w:rPr>
+        <w:t xml:space="preserve"> et al. 2008). </w:t>
+      </w:r>
+      <w:r>
+        <w:rPr>
+          <w:rFonts w:ascii="Times New Roman" w:hAnsi="Times New Roman" w:cs="Times New Roman"/>
+        </w:rPr>
+        <w:t xml:space="preserve">Expanzi </w:t>
+      </w:r>
+      <w:r>
+        <w:rPr>
+          <w:rFonts w:ascii="Times New Roman" w:hAnsi="Times New Roman" w:cs="Times New Roman"/>
+        </w:rPr>
+        <w:t xml:space="preserve">v </w:t>
+      </w:r>
+      <w:r>
+        <w:rPr>
+          <w:rFonts w:ascii="Times New Roman" w:hAnsi="Times New Roman" w:cs="Times New Roman"/>
+        </w:rPr>
+        <w:t>Čechách dále dokládají nálezy L. Ambrožové</w:t>
+      </w:r>
+      <w:r>
+        <w:rPr>
+          <w:rFonts w:ascii="Times New Roman" w:hAnsi="Times New Roman" w:cs="Times New Roman"/>
+        </w:rPr>
+        <w:t xml:space="preserve">, M. </w:t>
+      </w:r>
+      <w:r>
+        <w:rPr>
+          <w:rFonts w:ascii="Times New Roman" w:hAnsi="Times New Roman" w:cs="Times New Roman"/>
+        </w:rPr>
+        <w:lastRenderedPageBreak/>
+        <w:t>Kavky, V. Křivana</w:t>
+      </w:r>
+      <w:r>
+        <w:rPr>
+          <w:rFonts w:ascii="Times New Roman" w:hAnsi="Times New Roman" w:cs="Times New Roman"/>
+        </w:rPr>
+        <w:t xml:space="preserve"> </w:t>
+      </w:r>
+      <w:r>
+        <w:rPr>
+          <w:rFonts w:ascii="Times New Roman" w:hAnsi="Times New Roman" w:cs="Times New Roman"/>
+        </w:rPr>
+        <w:t xml:space="preserve">a </w:t>
+      </w:r>
+      <w:r>
+        <w:rPr>
+          <w:rFonts w:ascii="Times New Roman" w:hAnsi="Times New Roman" w:cs="Times New Roman"/>
+        </w:rPr>
+        <w:t xml:space="preserve">K. Chobota </w:t>
+      </w:r>
+      <w:r>
+        <w:rPr>
+          <w:rFonts w:ascii="Times New Roman" w:hAnsi="Times New Roman" w:cs="Times New Roman"/>
+        </w:rPr>
+        <w:t>(</w:t>
+      </w:r>
+      <w:r>
+        <w:rPr>
+          <w:rFonts w:ascii="Times New Roman" w:hAnsi="Times New Roman" w:cs="Times New Roman"/>
+          <w:smallCaps/>
+        </w:rPr>
+        <w:t>AOPK</w:t>
+      </w:r>
+      <w:r>
+        <w:rPr>
+          <w:rFonts w:ascii="Times New Roman" w:hAnsi="Times New Roman" w:cs="Times New Roman"/>
+        </w:rPr>
+        <w:t xml:space="preserve"> ČR, 2025).</w:t>
+      </w:r>
+      <w:r>
+        <w:rPr>
+          <w:rFonts w:ascii="Times New Roman" w:hAnsi="Times New Roman" w:cs="Times New Roman"/>
+        </w:rPr>
+        <w:t xml:space="preserve"> </w:t>
       </w:r>
       <w:bookmarkStart w:id="2" w:name="_GoBack"/>
+      <w:r>
+        <w:rPr>
+          <w:rFonts w:ascii="Times New Roman" w:hAnsi="Times New Roman" w:cs="Times New Roman"/>
+        </w:rPr>
+        <w:t>Podobný trend šíření byl zaznamenán i v sousedním Německu (</w:t>
+      </w:r>
+      <w:r>
+        <w:rPr>
+          <w:rFonts w:ascii="Times New Roman" w:hAnsi="Times New Roman" w:cs="Times New Roman"/>
+          <w:smallCaps/>
+        </w:rPr>
+        <w:t>iNaturalist</w:t>
+      </w:r>
+      <w:r>
+        <w:rPr>
+          <w:rFonts w:ascii="Times New Roman" w:hAnsi="Times New Roman" w:cs="Times New Roman"/>
+        </w:rPr>
+        <w:t xml:space="preserve"> </w:t>
+      </w:r>
+      <w:r>
+        <w:rPr>
+          <w:rFonts w:ascii="Times New Roman" w:hAnsi="Times New Roman" w:cs="Times New Roman"/>
+          <w:smallCaps/>
+        </w:rPr>
+        <w:t>contributors</w:t>
+      </w:r>
+      <w:r>
+        <w:rPr>
+          <w:rFonts w:ascii="Times New Roman" w:hAnsi="Times New Roman" w:cs="Times New Roman"/>
+        </w:rPr>
+        <w:t xml:space="preserve"> 2025)</w:t>
+      </w:r>
+      <w:r>
+        <w:rPr>
+          <w:rFonts w:ascii="Times New Roman" w:hAnsi="Times New Roman" w:cs="Times New Roman"/>
+        </w:rPr>
+        <w:t xml:space="preserve"> a v Belgii (</w:t>
+      </w:r>
+      <w:r>
+        <w:rPr>
+          <w:rFonts w:ascii="Times New Roman" w:hAnsi="Times New Roman" w:cs="Times New Roman"/>
+          <w:smallCaps/>
+        </w:rPr>
+        <w:t>Miessen a Thieren</w:t>
+      </w:r>
+      <w:r>
+        <w:rPr>
+          <w:rFonts w:ascii="Times New Roman" w:hAnsi="Times New Roman" w:cs="Times New Roman"/>
+        </w:rPr>
+        <w:t xml:space="preserve"> 1998)</w:t>
+      </w:r>
+      <w:r>
+        <w:rPr>
+          <w:rFonts w:ascii="Times New Roman" w:hAnsi="Times New Roman" w:cs="Times New Roman"/>
+        </w:rPr>
+        <w:t xml:space="preserve">. </w:t>
+      </w:r>
       <w:bookmarkEnd w:id="2"/>
-      <w:r>
-        <w:rPr>
-          <w:rFonts w:ascii="Times New Roman" w:hAnsi="Times New Roman" w:cs="Times New Roman"/>
-        </w:rPr>
-        <w:t xml:space="preserve">). </w:t>
-      </w:r>
-      <w:r>
-        <w:rPr>
-          <w:rFonts w:ascii="Times New Roman" w:hAnsi="Times New Roman" w:cs="Times New Roman"/>
-          <w:smallCaps/>
-        </w:rPr>
-        <w:t>Peřinková</w:t>
-      </w:r>
-      <w:r>
-        <w:rPr>
-          <w:rFonts w:ascii="Times New Roman" w:hAnsi="Times New Roman" w:cs="Times New Roman"/>
-        </w:rPr>
-        <w:t xml:space="preserve"> a </w:t>
-      </w:r>
-      <w:r>
-        <w:rPr>
-          <w:rFonts w:ascii="Times New Roman" w:hAnsi="Times New Roman" w:cs="Times New Roman"/>
-          <w:smallCaps/>
-        </w:rPr>
-        <w:t>Fischer</w:t>
-      </w:r>
-      <w:r>
-        <w:rPr>
-          <w:rFonts w:ascii="Times New Roman" w:hAnsi="Times New Roman" w:cs="Times New Roman"/>
-        </w:rPr>
-        <w:t xml:space="preserve"> (2010) popisují šíření druhu do středních poloh </w:t>
-      </w:r>
-      <w:r>
-        <w:rPr>
-          <w:rFonts w:ascii="Times New Roman" w:hAnsi="Times New Roman" w:cs="Times New Roman"/>
-        </w:rPr>
-        <w:t xml:space="preserve">na jihozápadní Moravě, </w:t>
-      </w:r>
-      <w:r>
-        <w:rPr>
-          <w:rFonts w:ascii="Times New Roman" w:hAnsi="Times New Roman" w:cs="Times New Roman"/>
-          <w:smallCaps/>
-        </w:rPr>
-        <w:t>Mertlik</w:t>
-      </w:r>
-      <w:r>
-        <w:rPr>
-          <w:rFonts w:ascii="Times New Roman" w:hAnsi="Times New Roman" w:cs="Times New Roman"/>
-        </w:rPr>
-        <w:t xml:space="preserve"> (2019, 2020) dokládá šíření</w:t>
-      </w:r>
-      <w:r>
-        <w:rPr>
-          <w:rFonts w:ascii="Times New Roman" w:hAnsi="Times New Roman" w:cs="Times New Roman"/>
-        </w:rPr>
-        <w:t xml:space="preserve"> v n</w:t>
-      </w:r>
-      <w:r>
-        <w:rPr>
-          <w:rFonts w:ascii="Times New Roman" w:hAnsi="Times New Roman" w:cs="Times New Roman"/>
-        </w:rPr>
-        <w:t>ižších polohách východních Čech.</w:t>
-      </w:r>
-      <w:r>
-        <w:rPr>
-          <w:rFonts w:ascii="Times New Roman" w:hAnsi="Times New Roman" w:cs="Times New Roman"/>
-        </w:rPr>
-        <w:t xml:space="preserve"> </w:t>
-      </w:r>
-      <w:r>
-        <w:rPr>
-          <w:rFonts w:ascii="Times New Roman" w:hAnsi="Times New Roman" w:cs="Times New Roman"/>
-          <w:i/>
-          <w:iCs/>
-        </w:rPr>
-        <w:t xml:space="preserve">E. </w:t>
-      </w:r>
-      <w:proofErr w:type="gramStart"/>
-      <w:r>
-        <w:rPr>
-          <w:rFonts w:ascii="Times New Roman" w:hAnsi="Times New Roman" w:cs="Times New Roman"/>
-          <w:i/>
-          <w:iCs/>
-        </w:rPr>
-        <w:t>fulvus</w:t>
-      </w:r>
-      <w:proofErr w:type="gramEnd"/>
-      <w:r>
-        <w:rPr>
-          <w:rFonts w:ascii="Times New Roman" w:hAnsi="Times New Roman" w:cs="Times New Roman"/>
-        </w:rPr>
-        <w:t xml:space="preserve"> </w:t>
-      </w:r>
-      <w:r>
-        <w:rPr>
-          <w:rFonts w:ascii="Times New Roman" w:hAnsi="Times New Roman" w:cs="Times New Roman"/>
-        </w:rPr>
-        <w:t>byl opět potvrzen na území Prahy (</w:t>
-      </w:r>
-      <w:r>
-        <w:rPr>
-          <w:rFonts w:ascii="Times New Roman" w:hAnsi="Times New Roman" w:cs="Times New Roman"/>
-          <w:smallCaps/>
-        </w:rPr>
-        <w:t>Sommer</w:t>
-      </w:r>
-      <w:r>
-        <w:rPr>
-          <w:rFonts w:ascii="Times New Roman" w:hAnsi="Times New Roman" w:cs="Times New Roman"/>
-        </w:rPr>
-        <w:t xml:space="preserve"> et al. 2024) a Českého krasu (</w:t>
-      </w:r>
-      <w:r>
-        <w:rPr>
-          <w:rFonts w:ascii="Times New Roman" w:hAnsi="Times New Roman" w:cs="Times New Roman"/>
-          <w:smallCaps/>
-        </w:rPr>
-        <w:t>Koštíř</w:t>
-      </w:r>
-      <w:r>
-        <w:rPr>
-          <w:rFonts w:ascii="Times New Roman" w:hAnsi="Times New Roman" w:cs="Times New Roman"/>
-        </w:rPr>
-        <w:t xml:space="preserve"> 2024). Nalezen byl i na Šumavě v nadmořské výšce 800 m. n. m. (</w:t>
-      </w:r>
-      <w:r>
-        <w:rPr>
-          <w:rFonts w:ascii="Times New Roman" w:hAnsi="Times New Roman" w:cs="Times New Roman"/>
-          <w:smallCaps/>
-        </w:rPr>
-        <w:t>Ambrožová</w:t>
-      </w:r>
-      <w:r>
-        <w:rPr>
-          <w:rFonts w:ascii="Times New Roman" w:hAnsi="Times New Roman" w:cs="Times New Roman"/>
-        </w:rPr>
-        <w:t xml:space="preserve"> et al. 2021). Historické údaje z území západních Čech byly publikovány z Františkových Lázní, Stříbra a Horažďovic (</w:t>
-      </w:r>
-      <w:r>
-        <w:rPr>
-          <w:rFonts w:ascii="Times New Roman" w:hAnsi="Times New Roman" w:cs="Times New Roman"/>
-          <w:smallCaps/>
-        </w:rPr>
-        <w:t>Juřena</w:t>
-      </w:r>
-      <w:r>
-        <w:rPr>
-          <w:rFonts w:ascii="Times New Roman" w:hAnsi="Times New Roman" w:cs="Times New Roman"/>
-        </w:rPr>
-        <w:t xml:space="preserve"> et al. 2008). Z území Plzeňského a Karlovarského kraje nebyl výskyt druhu v posledních desetiletích publikován (</w:t>
-      </w:r>
-      <w:r>
-        <w:rPr>
-          <w:rFonts w:ascii="Times New Roman" w:hAnsi="Times New Roman" w:cs="Times New Roman"/>
-          <w:smallCaps/>
-        </w:rPr>
-        <w:t>Týr</w:t>
-      </w:r>
-      <w:r>
-        <w:rPr>
-          <w:rFonts w:ascii="Times New Roman" w:hAnsi="Times New Roman" w:cs="Times New Roman"/>
-        </w:rPr>
-        <w:t xml:space="preserve"> 2021). Podobný trend šíření byl zaznamenán i v </w:t>
-      </w:r>
-      <w:r>
-        <w:rPr>
-          <w:rFonts w:ascii="Times New Roman" w:hAnsi="Times New Roman" w:cs="Times New Roman"/>
-        </w:rPr>
-        <w:lastRenderedPageBreak/>
-        <w:t>sousedním Německu (</w:t>
-      </w:r>
-      <w:r>
-        <w:rPr>
-          <w:rFonts w:ascii="Times New Roman" w:hAnsi="Times New Roman" w:cs="Times New Roman"/>
-          <w:smallCaps/>
-        </w:rPr>
-        <w:t>iNaturalist</w:t>
-      </w:r>
-      <w:r>
-        <w:rPr>
-          <w:rFonts w:ascii="Times New Roman" w:hAnsi="Times New Roman" w:cs="Times New Roman"/>
-        </w:rPr>
-        <w:t xml:space="preserve"> </w:t>
-      </w:r>
-      <w:r>
-        <w:rPr>
-          <w:rFonts w:ascii="Times New Roman" w:hAnsi="Times New Roman" w:cs="Times New Roman"/>
-          <w:smallCaps/>
-        </w:rPr>
-        <w:t>contributors</w:t>
-      </w:r>
-      <w:r>
-        <w:rPr>
-          <w:rFonts w:ascii="Times New Roman" w:hAnsi="Times New Roman" w:cs="Times New Roman"/>
-        </w:rPr>
-        <w:t xml:space="preserve"> </w:t>
-      </w:r>
-      <w:commentRangeStart w:id="3"/>
-      <w:r>
-        <w:rPr>
-          <w:rFonts w:ascii="Times New Roman" w:hAnsi="Times New Roman" w:cs="Times New Roman"/>
-        </w:rPr>
-        <w:t>2025</w:t>
-      </w:r>
-      <w:commentRangeEnd w:id="3"/>
-      <w:r>
-        <w:rPr>
-          <w:rStyle w:val="Odkaznakoment"/>
-        </w:rPr>
-        <w:commentReference w:id="3"/>
-      </w:r>
-      <w:r>
-        <w:rPr>
-          <w:rFonts w:ascii="Times New Roman" w:hAnsi="Times New Roman" w:cs="Times New Roman"/>
-        </w:rPr>
-        <w:t>)</w:t>
-      </w:r>
-      <w:r>
-        <w:rPr>
-          <w:rFonts w:ascii="Times New Roman" w:hAnsi="Times New Roman" w:cs="Times New Roman"/>
-        </w:rPr>
-        <w:t xml:space="preserve"> a v Belgii (</w:t>
-      </w:r>
-      <w:r>
-        <w:rPr>
-          <w:rFonts w:ascii="Times New Roman" w:hAnsi="Times New Roman" w:cs="Times New Roman"/>
-          <w:smallCaps/>
-        </w:rPr>
-        <w:t>Miessen a Thieren</w:t>
-      </w:r>
-      <w:r>
-        <w:rPr>
-          <w:rFonts w:ascii="Times New Roman" w:hAnsi="Times New Roman" w:cs="Times New Roman"/>
-        </w:rPr>
-        <w:t xml:space="preserve"> 1998)</w:t>
-      </w:r>
-      <w:r>
-        <w:rPr>
-          <w:rFonts w:ascii="Times New Roman" w:hAnsi="Times New Roman" w:cs="Times New Roman"/>
-        </w:rPr>
-        <w:t>. Výše uvedený nález představuje první publikovaný doklad výskytu druhu na území Plzeňského a Karlovarského kraje po 56 letech.</w:t>
-      </w:r>
     </w:p>
     <w:p>
       <w:pPr>
+        <w:pStyle w:val="Zkladntext"/>
+        <w:rPr>
+          <w:rFonts w:ascii="Times New Roman" w:hAnsi="Times New Roman" w:cs="Times New Roman"/>
+        </w:rPr>
+      </w:pPr>
+      <w:r>
+        <w:rPr>
+          <w:rFonts w:ascii="Times New Roman" w:hAnsi="Times New Roman" w:cs="Times New Roman"/>
+        </w:rPr>
+        <w:t>Z území Plzeňského a Karlovarského kraje nebyl výskyt druhu v posledních desetiletích publikován (</w:t>
+      </w:r>
+      <w:r>
+        <w:rPr>
+          <w:rFonts w:ascii="Times New Roman" w:hAnsi="Times New Roman" w:cs="Times New Roman"/>
+          <w:smallCaps/>
+        </w:rPr>
+        <w:t>Týr</w:t>
+      </w:r>
+      <w:r>
+        <w:rPr>
+          <w:rFonts w:ascii="Times New Roman" w:hAnsi="Times New Roman" w:cs="Times New Roman"/>
+        </w:rPr>
+        <w:t xml:space="preserve"> 2021). </w:t>
+      </w:r>
+      <w:r>
+        <w:rPr>
+          <w:rFonts w:ascii="Times New Roman" w:hAnsi="Times New Roman" w:cs="Times New Roman"/>
+        </w:rPr>
+        <w:t>Výše uvedený nález představuje první publikovaný doklad výskytu druhu na území Plzeňského a Karlovarského kraje po 56 letech.</w:t>
+      </w:r>
+    </w:p>
+    <w:p>
+      <w:pPr>
         <w:pStyle w:val="FirstParagraph"/>
         <w:rPr>
           <w:rFonts w:ascii="Times New Roman" w:hAnsi="Times New Roman" w:cs="Times New Roman"/>
         </w:rPr>
       </w:pPr>
-      <w:bookmarkStart w:id="4" w:name="poděkování"/>
+      <w:bookmarkStart w:id="3" w:name="poděkování"/>
       <w:bookmarkEnd w:id="1"/>
       <w:r>
         <w:rPr>
@@ -1049,7 +1040,19 @@
         <w:rPr>
           <w:rFonts w:ascii="Times New Roman" w:hAnsi="Times New Roman" w:cs="Times New Roman"/>
         </w:rPr>
-        <w:t>Děkuji K. Chobotovi (AOPK ČR, Praha) za revizi determinace ostatních druhů ve sběru.</w:t>
+        <w:t>Děkuji K. Chobotovi (AOPK ČR, Praha) za revizi deter</w:t>
+      </w:r>
+      <w:r>
+        <w:rPr>
+          <w:rFonts w:ascii="Times New Roman" w:hAnsi="Times New Roman" w:cs="Times New Roman"/>
+        </w:rPr>
+        <w:t>minace ostatních druhů ve sběru a cenné připomínky k textu. Děkuji V. Kolářovi (</w:t>
+      </w:r>
+      <w:r>
+        <w:rPr>
+          <w:rFonts w:ascii="Times New Roman" w:hAnsi="Times New Roman" w:cs="Times New Roman"/>
+        </w:rPr>
+        <w:t>PřF JU, České Budějovice).</w:t>
       </w:r>
     </w:p>
     <w:p>
@@ -1063,8 +1066,8 @@
           <w:szCs w:val="24"/>
         </w:rPr>
       </w:pPr>
-      <w:bookmarkStart w:id="5" w:name="přílohy"/>
-      <w:bookmarkEnd w:id="4"/>
+      <w:bookmarkStart w:id="4" w:name="přílohy"/>
+      <w:bookmarkEnd w:id="3"/>
       <w:r>
         <w:rPr>
           <w:rFonts w:ascii="Times New Roman" w:hAnsi="Times New Roman" w:cs="Times New Roman"/>
@@ -1132,7 +1135,25 @@
         <w:rPr>
           <w:rFonts w:ascii="Times New Roman" w:hAnsi="Times New Roman" w:cs="Times New Roman"/>
         </w:rPr>
-        <w:t xml:space="preserve"> Goeze, 1777 z lokality Horšovská obora. Foto: J. Gaigr</w:t>
+        <w:t xml:space="preserve"> Goeze, 1777 z l</w:t>
+      </w:r>
+      <w:r>
+        <w:rPr>
+          <w:rFonts w:ascii="Times New Roman" w:hAnsi="Times New Roman" w:cs="Times New Roman"/>
+        </w:rPr>
+        <w:t>okality Horšovská obora. Foto: V</w:t>
+      </w:r>
+      <w:r>
+        <w:rPr>
+          <w:rFonts w:ascii="Times New Roman" w:hAnsi="Times New Roman" w:cs="Times New Roman"/>
+        </w:rPr>
+        <w:t xml:space="preserve">. </w:t>
+      </w:r>
+      <w:r>
+        <w:rPr>
+          <w:rFonts w:ascii="Times New Roman" w:hAnsi="Times New Roman" w:cs="Times New Roman"/>
+        </w:rPr>
+        <w:t>Kolář</w:t>
       </w:r>
       <w:r>
         <w:rPr>
@@ -1153,7 +1174,25 @@
         <w:rPr>
           <w:rFonts w:ascii="Times New Roman" w:hAnsi="Times New Roman" w:cs="Times New Roman"/>
         </w:rPr>
-        <w:t xml:space="preserve"> Goeze, 1777 from the former Horšov game reserve site. Foto: J. Gaigr</w:t>
+        <w:t xml:space="preserve"> Goeze, 1777 from the fo</w:t>
+      </w:r>
+      <w:r>
+        <w:rPr>
+          <w:rFonts w:ascii="Times New Roman" w:hAnsi="Times New Roman" w:cs="Times New Roman"/>
+        </w:rPr>
+        <w:t>rmer Horšov game reserve site. Photo: V</w:t>
+      </w:r>
+      <w:r>
+        <w:rPr>
+          <w:rFonts w:ascii="Times New Roman" w:hAnsi="Times New Roman" w:cs="Times New Roman"/>
+        </w:rPr>
+        <w:t xml:space="preserve">. </w:t>
+      </w:r>
+      <w:r>
+        <w:rPr>
+          <w:rFonts w:ascii="Times New Roman" w:hAnsi="Times New Roman" w:cs="Times New Roman"/>
+        </w:rPr>
+        <w:t>Kolář</w:t>
       </w:r>
     </w:p>
     <w:p>
@@ -1453,8 +1492,8 @@
           <w:szCs w:val="24"/>
         </w:rPr>
       </w:pPr>
-      <w:bookmarkStart w:id="6" w:name="literatura"/>
-      <w:bookmarkEnd w:id="5"/>
+      <w:bookmarkStart w:id="5" w:name="literatura"/>
+      <w:bookmarkEnd w:id="4"/>
       <w:r>
         <w:rPr>
           <w:rFonts w:ascii="Times New Roman" w:hAnsi="Times New Roman" w:cs="Times New Roman"/>
@@ -1483,8 +1522,8 @@
           <w:rFonts w:ascii="Times New Roman" w:hAnsi="Times New Roman" w:cs="Times New Roman"/>
         </w:rPr>
       </w:pPr>
-      <w:bookmarkStart w:id="7" w:name="ref-ambrozova2021"/>
-      <w:bookmarkStart w:id="8" w:name="refs"/>
+      <w:bookmarkStart w:id="6" w:name="ref-ambrozova2021"/>
+      <w:bookmarkStart w:id="7" w:name="refs"/>
       <w:r>
         <w:rPr>
           <w:rFonts w:ascii="Times New Roman" w:hAnsi="Times New Roman" w:cs="Times New Roman"/>
@@ -1520,8 +1559,8 @@
           <w:rFonts w:ascii="Times New Roman" w:hAnsi="Times New Roman" w:cs="Times New Roman"/>
         </w:rPr>
       </w:pPr>
-      <w:bookmarkStart w:id="9" w:name="ref-aopk2025"/>
-      <w:bookmarkEnd w:id="7"/>
+      <w:bookmarkStart w:id="8" w:name="ref-aopk2025"/>
+      <w:bookmarkEnd w:id="6"/>
       <w:r>
         <w:rPr>
           <w:rFonts w:ascii="Times New Roman" w:hAnsi="Times New Roman" w:cs="Times New Roman"/>
@@ -1584,8 +1623,8 @@
           <w:rFonts w:ascii="Times New Roman" w:hAnsi="Times New Roman" w:cs="Times New Roman"/>
         </w:rPr>
       </w:pPr>
-      <w:bookmarkStart w:id="10" w:name="ref-hejda2017"/>
-      <w:bookmarkEnd w:id="9"/>
+      <w:bookmarkStart w:id="9" w:name="ref-hejda2017"/>
+      <w:bookmarkEnd w:id="8"/>
       <w:r>
         <w:rPr>
           <w:rFonts w:ascii="Times New Roman" w:hAnsi="Times New Roman" w:cs="Times New Roman"/>
@@ -1607,8 +1646,8 @@
           <w:rFonts w:ascii="Times New Roman" w:hAnsi="Times New Roman" w:cs="Times New Roman"/>
         </w:rPr>
       </w:pPr>
-      <w:bookmarkStart w:id="11" w:name="ref-chybik2005"/>
-      <w:bookmarkEnd w:id="10"/>
+      <w:bookmarkStart w:id="10" w:name="ref-chybik2005"/>
+      <w:bookmarkEnd w:id="9"/>
       <w:r>
         <w:rPr>
           <w:rFonts w:ascii="Times New Roman" w:hAnsi="Times New Roman" w:cs="Times New Roman"/>
@@ -1630,8 +1669,8 @@
           <w:rFonts w:ascii="Times New Roman" w:hAnsi="Times New Roman" w:cs="Times New Roman"/>
         </w:rPr>
       </w:pPr>
-      <w:bookmarkStart w:id="12" w:name="ref-iNaturalist2025"/>
-      <w:bookmarkEnd w:id="11"/>
+      <w:bookmarkStart w:id="11" w:name="ref-iNaturalist2025"/>
+      <w:bookmarkEnd w:id="10"/>
       <w:r>
         <w:rPr>
           <w:rFonts w:ascii="Times New Roman" w:hAnsi="Times New Roman" w:cs="Times New Roman"/>
@@ -1645,7 +1684,7 @@
         </w:rPr>
         <w:t xml:space="preserve"> 2025: iNaturalist Research-grade Observations. Dostupné z: </w:t>
       </w:r>
-      <w:hyperlink r:id="rId8">
+      <w:hyperlink r:id="rId6">
         <w:r>
           <w:rPr>
             <w:rStyle w:val="Hypertextovodkaz"/>
@@ -1663,8 +1702,8 @@
           <w:rFonts w:ascii="Times New Roman" w:hAnsi="Times New Roman" w:cs="Times New Roman"/>
         </w:rPr>
       </w:pPr>
-      <w:bookmarkStart w:id="13" w:name="ref-jurena2008"/>
-      <w:bookmarkEnd w:id="12"/>
+      <w:bookmarkStart w:id="12" w:name="ref-jurena2008"/>
+      <w:bookmarkEnd w:id="11"/>
       <w:r>
         <w:rPr>
           <w:rFonts w:ascii="Times New Roman" w:hAnsi="Times New Roman" w:cs="Times New Roman"/>
@@ -1686,8 +1725,8 @@
           <w:rFonts w:ascii="Times New Roman" w:hAnsi="Times New Roman" w:cs="Times New Roman"/>
         </w:rPr>
       </w:pPr>
-      <w:bookmarkStart w:id="14" w:name="ref-kostir2024"/>
-      <w:bookmarkEnd w:id="13"/>
+      <w:bookmarkStart w:id="13" w:name="ref-kostir2024"/>
+      <w:bookmarkEnd w:id="12"/>
       <w:r>
         <w:rPr>
           <w:rFonts w:ascii="Times New Roman" w:hAnsi="Times New Roman" w:cs="Times New Roman"/>
@@ -1709,8 +1748,8 @@
           <w:rFonts w:ascii="Times New Roman" w:hAnsi="Times New Roman" w:cs="Times New Roman"/>
         </w:rPr>
       </w:pPr>
-      <w:bookmarkStart w:id="15" w:name="ref-mertlik2019"/>
-      <w:bookmarkEnd w:id="14"/>
+      <w:bookmarkStart w:id="14" w:name="ref-mertlik2019"/>
+      <w:bookmarkEnd w:id="13"/>
       <w:r>
         <w:rPr>
           <w:rFonts w:ascii="Times New Roman" w:hAnsi="Times New Roman" w:cs="Times New Roman"/>
@@ -1732,8 +1771,8 @@
           <w:rFonts w:ascii="Times New Roman" w:hAnsi="Times New Roman" w:cs="Times New Roman"/>
         </w:rPr>
       </w:pPr>
-      <w:bookmarkStart w:id="16" w:name="ref-mertlik2020"/>
-      <w:bookmarkEnd w:id="15"/>
+      <w:bookmarkStart w:id="15" w:name="ref-mertlik2020"/>
+      <w:bookmarkEnd w:id="14"/>
       <w:r>
         <w:rPr>
           <w:rFonts w:ascii="Times New Roman" w:hAnsi="Times New Roman" w:cs="Times New Roman"/>
@@ -1788,24 +1827,15 @@
           <w:rFonts w:ascii="Times New Roman" w:hAnsi="Times New Roman" w:cs="Times New Roman"/>
         </w:rPr>
       </w:pPr>
-      <w:bookmarkStart w:id="17" w:name="ref-perinkova2010"/>
-      <w:bookmarkEnd w:id="16"/>
-      <w:r>
-        <w:rPr>
-          <w:rFonts w:ascii="Times New Roman" w:hAnsi="Times New Roman" w:cs="Times New Roman"/>
-          <w:smallCaps/>
-        </w:rPr>
-        <w:t xml:space="preserve">Peřinková P. &amp; Fischer </w:t>
-      </w:r>
-      <w:proofErr w:type="gramStart"/>
-      <w:r>
-        <w:rPr>
-          <w:rFonts w:ascii="Times New Roman" w:hAnsi="Times New Roman" w:cs="Times New Roman"/>
-          <w:smallCaps/>
-        </w:rPr>
-        <w:t>O.A.</w:t>
-      </w:r>
-      <w:proofErr w:type="gramEnd"/>
+      <w:bookmarkStart w:id="16" w:name="ref-perinkova2010"/>
+      <w:bookmarkEnd w:id="15"/>
+      <w:r>
+        <w:rPr>
+          <w:rFonts w:ascii="Times New Roman" w:hAnsi="Times New Roman" w:cs="Times New Roman"/>
+          <w:smallCaps/>
+        </w:rPr>
+        <w:t>Peřinková P. &amp; Fischer O.A.</w:t>
+      </w:r>
       <w:r>
         <w:rPr>
           <w:rFonts w:ascii="Times New Roman" w:hAnsi="Times New Roman" w:cs="Times New Roman"/>
@@ -1820,8 +1850,8 @@
           <w:rFonts w:ascii="Times New Roman" w:hAnsi="Times New Roman" w:cs="Times New Roman"/>
         </w:rPr>
       </w:pPr>
-      <w:bookmarkStart w:id="18" w:name="ref-sommer2024"/>
-      <w:bookmarkEnd w:id="17"/>
+      <w:bookmarkStart w:id="17" w:name="ref-sommer2024"/>
+      <w:bookmarkEnd w:id="16"/>
       <w:r>
         <w:rPr>
           <w:rFonts w:ascii="Times New Roman" w:hAnsi="Times New Roman" w:cs="Times New Roman"/>
@@ -1843,8 +1873,8 @@
           <w:rFonts w:ascii="Times New Roman" w:hAnsi="Times New Roman" w:cs="Times New Roman"/>
         </w:rPr>
       </w:pPr>
-      <w:bookmarkStart w:id="19" w:name="ref-tesar1957"/>
-      <w:bookmarkEnd w:id="18"/>
+      <w:bookmarkStart w:id="18" w:name="ref-tesar1957"/>
+      <w:bookmarkEnd w:id="17"/>
       <w:r>
         <w:rPr>
           <w:rFonts w:ascii="Times New Roman" w:hAnsi="Times New Roman" w:cs="Times New Roman"/>
@@ -1856,35 +1886,7 @@
         <w:rPr>
           <w:rFonts w:ascii="Times New Roman" w:hAnsi="Times New Roman" w:cs="Times New Roman"/>
         </w:rPr>
-        <w:t xml:space="preserve"> 1957: Brouci listorozí, Lamellicornia. Díl II. </w:t>
-      </w:r>
-      <w:proofErr w:type="gramStart"/>
-      <w:r>
-        <w:rPr>
-          <w:rFonts w:ascii="Times New Roman" w:hAnsi="Times New Roman" w:cs="Times New Roman"/>
-        </w:rPr>
-        <w:t>Scarabaeidae</w:t>
-      </w:r>
-      <w:proofErr w:type="gramEnd"/>
-      <w:r>
-        <w:rPr>
-          <w:rFonts w:ascii="Times New Roman" w:hAnsi="Times New Roman" w:cs="Times New Roman"/>
-        </w:rPr>
-        <w:t>–</w:t>
-      </w:r>
-      <w:proofErr w:type="gramStart"/>
-      <w:r>
-        <w:rPr>
-          <w:rFonts w:ascii="Times New Roman" w:hAnsi="Times New Roman" w:cs="Times New Roman"/>
-        </w:rPr>
-        <w:t>vrubounovití</w:t>
-      </w:r>
-      <w:proofErr w:type="gramEnd"/>
-      <w:r>
-        <w:rPr>
-          <w:rFonts w:ascii="Times New Roman" w:hAnsi="Times New Roman" w:cs="Times New Roman"/>
-        </w:rPr>
-        <w:t>, Laparosticti. Fauna ČSR 11. NČSAV, Praha 326</w:t>
+        <w:t xml:space="preserve"> 1957: Brouci listorozí, Lamellicornia. Díl II. Scarabaeidae–vrubounovití, Laparosticti. Fauna ČSR 11. NČSAV, Praha 326</w:t>
       </w:r>
     </w:p>
     <w:p>
@@ -1894,24 +1896,24 @@
           <w:rFonts w:ascii="Times New Roman" w:hAnsi="Times New Roman" w:cs="Times New Roman"/>
         </w:rPr>
       </w:pPr>
-      <w:bookmarkStart w:id="20" w:name="ref-tyr2021soupis"/>
+      <w:bookmarkStart w:id="19" w:name="ref-tyr2021soupis"/>
+      <w:bookmarkEnd w:id="18"/>
+      <w:r>
+        <w:rPr>
+          <w:rFonts w:ascii="Times New Roman" w:hAnsi="Times New Roman" w:cs="Times New Roman"/>
+          <w:smallCaps/>
+        </w:rPr>
+        <w:t>Týr V.</w:t>
+      </w:r>
+      <w:r>
+        <w:rPr>
+          <w:rFonts w:ascii="Times New Roman" w:hAnsi="Times New Roman" w:cs="Times New Roman"/>
+        </w:rPr>
+        <w:t xml:space="preserve"> 2021: Soupis nálezů vrubounovitých brouků (Coleoptera: Scarabaeoidea) ze západních Čech. Inventory of lamellicorn beetles (Coleoptera: Scarabaeoidea) from western Bohemia). Západočeské entomologické listy Supplementum 2: 1–85.</w:t>
+      </w:r>
+      <w:bookmarkEnd w:id="5"/>
+      <w:bookmarkEnd w:id="7"/>
       <w:bookmarkEnd w:id="19"/>
-      <w:r>
-        <w:rPr>
-          <w:rFonts w:ascii="Times New Roman" w:hAnsi="Times New Roman" w:cs="Times New Roman"/>
-          <w:smallCaps/>
-        </w:rPr>
-        <w:t>Týr V.</w:t>
-      </w:r>
-      <w:r>
-        <w:rPr>
-          <w:rFonts w:ascii="Times New Roman" w:hAnsi="Times New Roman" w:cs="Times New Roman"/>
-        </w:rPr>
-        <w:t xml:space="preserve"> 2021: Soupis nálezů vrubounovitých brouků (Coleoptera: Scarabaeoidea) ze západních Čech. Inventory of lamellicorn beetles (Coleoptera: Scarabaeoidea) from western Bohemia). Západočeské entomologické listy Supplementum 2: 1–85.</w:t>
-      </w:r>
-      <w:bookmarkEnd w:id="6"/>
-      <w:bookmarkEnd w:id="8"/>
-      <w:bookmarkEnd w:id="20"/>
     </w:p>
     <w:sectPr>
       <w:pgSz w:w="12240" w:h="15840"/>
@@ -1920,41 +1922,6 @@
     </w:sectPr>
   </w:body>
 </w:document>
-</file>
-
-<file path=word/comments.xml><?xml version="1.0" encoding="utf-8"?>
-<w:comments xmlns:wpc="http://schemas.microsoft.com/office/word/2010/wordprocessingCanvas" xmlns:cx="http://schemas.microsoft.com/office/drawing/2014/chartex" xmlns:cx1="http://schemas.microsoft.com/office/drawing/2015/9/8/chartex" xmlns:mc="http://schemas.openxmlformats.org/markup-compatibility/2006" xmlns:o="urn:schemas-microsoft-com:office:office" xmlns:r="http://schemas.openxmlformats.org/officeDocument/2006/relationships" xmlns:m="http://schemas.openxmlformats.org/officeDocument/2006/math" xmlns:v="urn:schemas-microsoft-com:vml" xmlns:wp14="http://schemas.microsoft.com/office/word/2010/wordprocessingDrawing" xmlns:wp="http://schemas.openxmlformats.org/drawingml/2006/wordprocessingDrawing" xmlns:w10="urn:schemas-microsoft-com:office:word" xmlns:w="http://schemas.openxmlformats.org/wordprocessingml/2006/main" xmlns:w14="http://schemas.microsoft.com/office/word/2010/wordml" xmlns:w15="http://schemas.microsoft.com/office/word/2012/wordml" xmlns:w16se="http://schemas.microsoft.com/office/word/2015/wordml/symex" xmlns:wpg="http://schemas.microsoft.com/office/word/2010/wordprocessingGroup" xmlns:wpi="http://schemas.microsoft.com/office/word/2010/wordprocessingInk" xmlns:wne="http://schemas.microsoft.com/office/word/2006/wordml" xmlns:wps="http://schemas.microsoft.com/office/word/2010/wordprocessingShape" mc:Ignorable="w14 w15 w16se wp14">
-  <w:comment w:id="3" w:author="Karel Chobot" w:date="2025-11-11T16:29:00Z" w:initials="KC">
-    <w:p>
-      <w:pPr>
-        <w:pStyle w:val="Textkomente"/>
-      </w:pPr>
-      <w:r>
-        <w:rPr>
-          <w:rStyle w:val="Odkaznakoment"/>
-        </w:rPr>
-        <w:annotationRef/>
-      </w:r>
-      <w:r>
-        <w:t xml:space="preserve">podle mne je tady třeba ocitovat nálezy v NDOP – mimo tyto publikace.  </w:t>
-      </w:r>
-      <w:proofErr w:type="gramStart"/>
-      <w:r>
-        <w:t>kde</w:t>
-      </w:r>
-      <w:proofErr w:type="gramEnd"/>
-      <w:r>
-        <w:t xml:space="preserve"> nám data také přibývají. V mapě citaci máš</w:t>
-      </w:r>
-    </w:p>
-  </w:comment>
-</w:comments>
-</file>
-
-<file path=word/commentsExtended.xml><?xml version="1.0" encoding="utf-8"?>
-<w15:commentsEx xmlns:wpc="http://schemas.microsoft.com/office/word/2010/wordprocessingCanvas" xmlns:cx="http://schemas.microsoft.com/office/drawing/2014/chartex" xmlns:cx1="http://schemas.microsoft.com/office/drawing/2015/9/8/chartex" xmlns:mc="http://schemas.openxmlformats.org/markup-compatibility/2006" xmlns:o="urn:schemas-microsoft-com:office:office" xmlns:r="http://schemas.openxmlformats.org/officeDocument/2006/relationships" xmlns:m="http://schemas.openxmlformats.org/officeDocument/2006/math" xmlns:v="urn:schemas-microsoft-com:vml" xmlns:wp14="http://schemas.microsoft.com/office/word/2010/wordprocessingDrawing" xmlns:wp="http://schemas.openxmlformats.org/drawingml/2006/wordprocessingDrawing" xmlns:w10="urn:schemas-microsoft-com:office:word" xmlns:w="http://schemas.openxmlformats.org/wordprocessingml/2006/main" xmlns:w14="http://schemas.microsoft.com/office/word/2010/wordml" xmlns:w15="http://schemas.microsoft.com/office/word/2012/wordml" xmlns:w16se="http://schemas.microsoft.com/office/word/2015/wordml/symex" xmlns:wpg="http://schemas.microsoft.com/office/word/2010/wordprocessingGroup" xmlns:wpi="http://schemas.microsoft.com/office/word/2010/wordprocessingInk" xmlns:wne="http://schemas.microsoft.com/office/word/2006/wordml" xmlns:wps="http://schemas.microsoft.com/office/word/2010/wordprocessingShape" mc:Ignorable="w14 w15 w16se wp14">
-  <w15:commentEx w15:paraId="3E46348A" w15:done="0"/>
-</w15:commentsEx>
 </file>
 
 <file path=word/numbering.xml><?xml version="1.0" encoding="utf-8"?>
@@ -2040,14 +2007,6 @@
     <w:abstractNumId w:val="0"/>
   </w:num>
 </w:numbering>
-</file>
-
-<file path=word/people.xml><?xml version="1.0" encoding="utf-8"?>
-<w15:people xmlns:wpc="http://schemas.microsoft.com/office/word/2010/wordprocessingCanvas" xmlns:cx="http://schemas.microsoft.com/office/drawing/2014/chartex" xmlns:cx1="http://schemas.microsoft.com/office/drawing/2015/9/8/chartex" xmlns:mc="http://schemas.openxmlformats.org/markup-compatibility/2006" xmlns:o="urn:schemas-microsoft-com:office:office" xmlns:r="http://schemas.openxmlformats.org/officeDocument/2006/relationships" xmlns:m="http://schemas.openxmlformats.org/officeDocument/2006/math" xmlns:v="urn:schemas-microsoft-com:vml" xmlns:wp14="http://schemas.microsoft.com/office/word/2010/wordprocessingDrawing" xmlns:wp="http://schemas.openxmlformats.org/drawingml/2006/wordprocessingDrawing" xmlns:w10="urn:schemas-microsoft-com:office:word" xmlns:w="http://schemas.openxmlformats.org/wordprocessingml/2006/main" xmlns:w14="http://schemas.microsoft.com/office/word/2010/wordml" xmlns:w15="http://schemas.microsoft.com/office/word/2012/wordml" xmlns:w16se="http://schemas.microsoft.com/office/word/2015/wordml/symex" xmlns:wpg="http://schemas.microsoft.com/office/word/2010/wordprocessingGroup" xmlns:wpi="http://schemas.microsoft.com/office/word/2010/wordprocessingInk" xmlns:wne="http://schemas.microsoft.com/office/word/2006/wordml" xmlns:wps="http://schemas.microsoft.com/office/word/2010/wordprocessingShape" mc:Ignorable="w14 w15 w16se wp14">
-  <w15:person w15:author="Karel Chobot">
-    <w15:presenceInfo w15:providerId="AD" w15:userId="S-1-5-21-3731094881-1316039422-2562985787-1143"/>
-  </w15:person>
-</w15:people>
 </file>
 
 <file path=word/styles.xml><?xml version="1.0" encoding="utf-8"?>

</xml_diff>